<commit_message>
Add general information section with anchors and save/load functionality; enhance canopy data processing and error handling
</commit_message>
<xml_diff>
--- a/app/costSheetGen/costSheetResources/costSheet_canopy.docx
+++ b/app/costSheetGen/costSheetResources/costSheet_canopy.docx
@@ -3411,16 +3411,6 @@
               </w:rPr>
               <w:t>section</w:t>
             </w:r>
-            <w:r>
-              <w:rPr>
-                <w:rFonts w:eastAsia="Times New Roman" w:cs="Arial"/>
-                <w:color w:val="000000"/>
-                <w:sz w:val="18"/>
-                <w:szCs w:val="18"/>
-                <w:lang w:eastAsia="en-GB"/>
-              </w:rPr>
-              <w:t>s</w:t>
-            </w:r>
             <w:proofErr w:type="spellEnd"/>
             <w:r>
               <w:rPr>
@@ -3570,7 +3560,6 @@
               </w:rPr>
             </w:pPr>
             <w:proofErr w:type="spellStart"/>
-            <w:proofErr w:type="gramStart"/>
             <w:r>
               <w:rPr>
                 <w:rFonts w:eastAsia="Times New Roman" w:cs="Arial"/>
@@ -3589,18 +3578,7 @@
                 <w:szCs w:val="18"/>
                 <w:lang w:eastAsia="en-GB"/>
               </w:rPr>
-              <w:t>extract</w:t>
-            </w:r>
-            <w:proofErr w:type="gramEnd"/>
-            <w:r>
-              <w:rPr>
-                <w:rFonts w:eastAsia="Times New Roman" w:cs="Arial"/>
-                <w:color w:val="000000"/>
-                <w:sz w:val="18"/>
-                <w:szCs w:val="18"/>
-                <w:lang w:eastAsia="en-GB"/>
-              </w:rPr>
-              <w:t>_static_pa</w:t>
+              <w:t>extract_static</w:t>
             </w:r>
             <w:proofErr w:type="spellEnd"/>
           </w:p>
@@ -5324,7 +5302,17 @@
                 <w:szCs w:val="18"/>
                 <w:lang w:eastAsia="en-GB"/>
               </w:rPr>
-              <w:t>no</w:t>
+              <w:t>n</w:t>
+            </w:r>
+            <w:r>
+              <w:rPr>
+                <w:rFonts w:eastAsia="Times New Roman" w:cs="Arial"/>
+                <w:color w:val="000000"/>
+                <w:sz w:val="18"/>
+                <w:szCs w:val="18"/>
+                <w:lang w:eastAsia="en-GB"/>
+              </w:rPr>
+              <w:t>umber</w:t>
             </w:r>
             <w:proofErr w:type="spellEnd"/>
           </w:p>
@@ -7915,27 +7903,7 @@
                 <w:szCs w:val="18"/>
                 <w:lang w:eastAsia="en-GB"/>
               </w:rPr>
-              <w:t>{%</w:t>
-            </w:r>
-            <w:r>
-              <w:rPr>
-                <w:rFonts w:eastAsia="Times New Roman" w:cs="Arial"/>
-                <w:color w:val="000000"/>
-                <w:sz w:val="18"/>
-                <w:szCs w:val="18"/>
-                <w:lang w:eastAsia="en-GB"/>
-              </w:rPr>
-              <w:t xml:space="preserve"> </w:t>
-            </w:r>
-            <w:r>
-              <w:rPr>
-                <w:rFonts w:eastAsia="Times New Roman" w:cs="Arial"/>
-                <w:color w:val="000000"/>
-                <w:sz w:val="18"/>
-                <w:szCs w:val="18"/>
-                <w:lang w:eastAsia="en-GB"/>
-              </w:rPr>
-              <w:t xml:space="preserve">for canopy in </w:t>
+              <w:t xml:space="preserve">{%for canopy in </w:t>
             </w:r>
             <w:proofErr w:type="spellStart"/>
             <w:r>
@@ -9614,7 +9582,6 @@
         </w:rPr>
         <w:t xml:space="preserve">{% if </w:t>
       </w:r>
-      <w:proofErr w:type="spellStart"/>
       <w:r>
         <w:rPr>
           <w:rFonts w:eastAsia="Times New Roman" w:cs="Arial"/>
@@ -9623,9 +9590,8 @@
           <w:szCs w:val="18"/>
           <w:lang w:eastAsia="en-GB"/>
         </w:rPr>
-        <w:t>floor_</w:t>
-      </w:r>
-      <w:proofErr w:type="gramStart"/>
+        <w:t>true</w:t>
+      </w:r>
       <w:r>
         <w:rPr>
           <w:rFonts w:eastAsia="Times New Roman" w:cs="Arial"/>
@@ -9634,29 +9600,7 @@
           <w:szCs w:val="18"/>
           <w:lang w:eastAsia="en-GB"/>
         </w:rPr>
-        <w:t>data.cladding</w:t>
-      </w:r>
-      <w:proofErr w:type="gramEnd"/>
-      <w:r>
-        <w:rPr>
-          <w:rFonts w:eastAsia="Times New Roman" w:cs="Arial"/>
-          <w:color w:val="000000"/>
-          <w:sz w:val="18"/>
-          <w:szCs w:val="18"/>
-          <w:lang w:eastAsia="en-GB"/>
-        </w:rPr>
-        <w:t>_total</w:t>
-      </w:r>
-      <w:proofErr w:type="spellEnd"/>
-      <w:r>
-        <w:rPr>
-          <w:rFonts w:eastAsia="Times New Roman" w:cs="Arial"/>
-          <w:color w:val="000000"/>
-          <w:sz w:val="18"/>
-          <w:szCs w:val="18"/>
-          <w:lang w:eastAsia="en-GB"/>
-        </w:rPr>
-        <w:t xml:space="preserve"> &gt; 0 %}</w:t>
+        <w:t xml:space="preserve"> %}</w:t>
       </w:r>
     </w:p>
     <w:tbl>
@@ -10193,18 +10137,6 @@
               </w:rPr>
               <w:t>}}</w:t>
             </w:r>
-          </w:p>
-          <w:p>
-            <w:pPr>
-              <w:spacing w:after="0" w:line="276" w:lineRule="auto"/>
-              <w:rPr>
-                <w:rFonts w:eastAsia="Times New Roman" w:cs="Arial"/>
-                <w:color w:val="000000"/>
-                <w:sz w:val="18"/>
-                <w:szCs w:val="18"/>
-                <w:lang w:eastAsia="en-GB"/>
-              </w:rPr>
-            </w:pPr>
           </w:p>
         </w:tc>
         <w:tc>
@@ -12354,6 +12286,7 @@
                 <w:sz w:val="24"/>
                 <w:lang w:eastAsia="en-GB"/>
               </w:rPr>
+              <w:lastRenderedPageBreak/>
               <w:t>£</w:t>
             </w:r>
           </w:p>
@@ -13758,7 +13691,6 @@
           <w:sz w:val="18"/>
           <w:szCs w:val="18"/>
         </w:rPr>
-        <w:lastRenderedPageBreak/>
         <w:t>Fire Suppression System.</w:t>
       </w:r>
     </w:p>
@@ -13842,6 +13774,7 @@
           <w:sz w:val="18"/>
           <w:szCs w:val="18"/>
         </w:rPr>
+        <w:lastRenderedPageBreak/>
         <w:t>Gas Interlocking System in accordance with BS:6173, to include gas solenoid valve and proving sensors.</w:t>
       </w:r>
     </w:p>
@@ -15735,7 +15668,6 @@
           <w:sz w:val="13"/>
           <w:szCs w:val="15"/>
         </w:rPr>
-        <w:lastRenderedPageBreak/>
         <w:t>1.10</w:t>
       </w:r>
       <w:r>
@@ -15894,6 +15826,7 @@
           <w:sz w:val="13"/>
           <w:szCs w:val="15"/>
         </w:rPr>
+        <w:lastRenderedPageBreak/>
         <w:t>1.15</w:t>
       </w:r>
       <w:r>
@@ -16845,11 +16778,7 @@
       </w:r>
       <w:r>
         <w:tab/>
-        <w:t xml:space="preserve">Notwithstanding that the goods (or any part of them) remain the property of Halton Foodservice; the Customer may sell or use the goods in the ordinary course of the Customers business at full market value for the account of Halton Foodservice.  Any such sale or dealing shall be a sale or use of Halton Foodservice’s property by the Customer on the Customer’s own behalf and the Customer shall deal as principal when making such sale or dealings.  Until property in the goods passes </w:t>
-      </w:r>
-      <w:r>
-        <w:lastRenderedPageBreak/>
-        <w:t>from Halton Foodservice the entire proceeds of sale or otherwise of the goods shall be held in trust for Halton Foodservice and shall not be mixed with other monies or paid into any overdrawn bank account and shall be at all material times identified as Halton Foodservice’s money.</w:t>
+        <w:t>Notwithstanding that the goods (or any part of them) remain the property of Halton Foodservice; the Customer may sell or use the goods in the ordinary course of the Customers business at full market value for the account of Halton Foodservice.  Any such sale or dealing shall be a sale or use of Halton Foodservice’s property by the Customer on the Customer’s own behalf and the Customer shall deal as principal when making such sale or dealings.  Until property in the goods passes from Halton Foodservice the entire proceeds of sale or otherwise of the goods shall be held in trust for Halton Foodservice and shall not be mixed with other monies or paid into any overdrawn bank account and shall be at all material times identified as Halton Foodservice’s money.</w:t>
       </w:r>
     </w:p>
     <w:p>
@@ -16881,6 +16810,7 @@
         <w:pStyle w:val="BodyTextIndent2"/>
       </w:pPr>
       <w:r>
+        <w:lastRenderedPageBreak/>
         <w:t xml:space="preserve">8.7 </w:t>
       </w:r>
       <w:r>

</xml_diff>

<commit_message>
Refactor canopyExcel and canopyMain to improve data processing and formatting; add new functions for cell formatting and calculations, including rounding prices and handling cladding data. Update template paths for consistency. Enhance error handling and streamline Excel file generation.
</commit_message>
<xml_diff>
--- a/app/costSheetGen/costSheetResources/costSheet_canopy.docx
+++ b/app/costSheetGen/costSheetResources/costSheet_canopy.docx
@@ -1332,6 +1332,23 @@
     </w:p>
     <w:p>
       <w:pPr>
+        <w:spacing w:after="0" w:line="200" w:lineRule="atLeast"/>
+        <w:jc w:val="center"/>
+        <w:rPr>
+          <w:b/>
+          <w:szCs w:val="20"/>
+        </w:rPr>
+      </w:pPr>
+      <w:r>
+        <w:rPr>
+          <w:b/>
+          <w:szCs w:val="20"/>
+        </w:rPr>
+        <w:t>We specifically exclude any works not mentioned for within this quotation. If you think we have missed something out, please call the Sales Team immediately for clarification.</w:t>
+      </w:r>
+    </w:p>
+    <w:p>
+      <w:pPr>
         <w:tabs>
           <w:tab w:val="left" w:pos="1440"/>
           <w:tab w:val="right" w:pos="8730"/>
@@ -1339,26 +1356,10 @@
         <w:spacing w:after="0" w:line="276" w:lineRule="auto"/>
         <w:rPr>
           <w:rFonts w:cs="Arial"/>
-          <w:szCs w:val="20"/>
-        </w:rPr>
-      </w:pPr>
-    </w:p>
-    <w:p>
-      <w:pPr>
-        <w:spacing w:after="0" w:line="200" w:lineRule="atLeast"/>
-        <w:jc w:val="center"/>
-        <w:rPr>
-          <w:b/>
-          <w:szCs w:val="20"/>
-        </w:rPr>
-      </w:pPr>
-      <w:r>
-        <w:rPr>
-          <w:b/>
-          <w:szCs w:val="20"/>
-        </w:rPr>
-        <w:t>We specifically exclude any works not mentioned for within this quotation. If you think we have missed something out, please call the Sales Team immediately for clarification.</w:t>
-      </w:r>
+          <w:bCs/>
+          <w:szCs w:val="20"/>
+        </w:rPr>
+      </w:pPr>
     </w:p>
     <w:p>
       <w:pPr>
@@ -1369,8 +1370,9 @@
         <w:spacing w:after="0" w:line="276" w:lineRule="auto"/>
         <w:rPr>
           <w:rFonts w:cs="Arial"/>
-          <w:bCs/>
-          <w:szCs w:val="20"/>
+          <w:b/>
+          <w:color w:val="2499D5"/>
+          <w:sz w:val="24"/>
         </w:rPr>
       </w:pPr>
     </w:p>
@@ -1384,21 +1386,6 @@
         <w:rPr>
           <w:rFonts w:cs="Arial"/>
           <w:b/>
-          <w:color w:val="2499D5"/>
-          <w:sz w:val="24"/>
-        </w:rPr>
-      </w:pPr>
-    </w:p>
-    <w:p>
-      <w:pPr>
-        <w:tabs>
-          <w:tab w:val="left" w:pos="1440"/>
-          <w:tab w:val="right" w:pos="8730"/>
-        </w:tabs>
-        <w:spacing w:after="0" w:line="276" w:lineRule="auto"/>
-        <w:rPr>
-          <w:rFonts w:cs="Arial"/>
-          <w:b/>
           <w:sz w:val="24"/>
         </w:rPr>
       </w:pPr>
@@ -1595,44 +1582,6 @@
         </w:rPr>
         <w:t xml:space="preserve"> illumination level of 500 lux to the cooking surface.</w:t>
       </w:r>
-    </w:p>
-    <w:p>
-      <w:pPr>
-        <w:tabs>
-          <w:tab w:val="left" w:pos="1440"/>
-          <w:tab w:val="right" w:pos="8730"/>
-        </w:tabs>
-        <w:spacing w:after="0" w:line="200" w:lineRule="atLeast"/>
-        <w:rPr>
-          <w:szCs w:val="20"/>
-        </w:rPr>
-      </w:pPr>
-      <w:proofErr w:type="gramStart"/>
-      <w:r>
-        <w:rPr>
-          <w:szCs w:val="20"/>
-        </w:rPr>
-        <w:t>{{ model</w:t>
-      </w:r>
-      <w:proofErr w:type="gramEnd"/>
-      <w:r>
-        <w:rPr>
-          <w:szCs w:val="20"/>
-        </w:rPr>
-        <w:t xml:space="preserve"> }}</w:t>
-      </w:r>
-    </w:p>
-    <w:p>
-      <w:pPr>
-        <w:tabs>
-          <w:tab w:val="left" w:pos="1440"/>
-          <w:tab w:val="right" w:pos="8730"/>
-        </w:tabs>
-        <w:spacing w:after="0" w:line="200" w:lineRule="atLeast"/>
-        <w:rPr>
-          <w:szCs w:val="20"/>
-        </w:rPr>
-      </w:pPr>
     </w:p>
     <w:p>
       <w:pPr>
@@ -3639,7 +3588,7 @@
                 <w:szCs w:val="18"/>
                 <w:lang w:eastAsia="en-GB"/>
               </w:rPr>
-              <w:t xml:space="preserve">{% if </w:t>
+              <w:t>{{</w:t>
             </w:r>
             <w:proofErr w:type="spellStart"/>
             <w:proofErr w:type="gramStart"/>
@@ -3651,7 +3600,17 @@
                 <w:szCs w:val="18"/>
                 <w:lang w:eastAsia="en-GB"/>
               </w:rPr>
-              <w:t>canopy.suply</w:t>
+              <w:t>canopy</w:t>
+            </w:r>
+            <w:r>
+              <w:rPr>
+                <w:rFonts w:eastAsia="Times New Roman" w:cs="Arial"/>
+                <w:color w:val="000000"/>
+                <w:sz w:val="18"/>
+                <w:szCs w:val="18"/>
+                <w:lang w:eastAsia="en-GB"/>
+              </w:rPr>
+              <w:t>.makeup</w:t>
             </w:r>
             <w:proofErr w:type="gramEnd"/>
             <w:r>
@@ -3673,55 +3632,8 @@
                 <w:szCs w:val="18"/>
                 <w:lang w:eastAsia="en-GB"/>
               </w:rPr>
-              <w:t xml:space="preserve"> is not none %}</w:t>
-            </w:r>
-          </w:p>
-          <w:p>
-            <w:pPr>
-              <w:spacing w:after="0" w:line="240" w:lineRule="auto"/>
-              <w:jc w:val="center"/>
-              <w:rPr>
-                <w:rFonts w:eastAsia="Times New Roman" w:cs="Arial"/>
-                <w:color w:val="000000"/>
-                <w:sz w:val="18"/>
-                <w:szCs w:val="18"/>
-                <w:lang w:eastAsia="en-GB"/>
-              </w:rPr>
-            </w:pPr>
-            <w:r>
-              <w:rPr>
-                <w:rFonts w:eastAsia="Times New Roman" w:cs="Arial"/>
-                <w:color w:val="000000"/>
-                <w:sz w:val="18"/>
-                <w:szCs w:val="18"/>
-                <w:lang w:eastAsia="en-GB"/>
-              </w:rPr>
-              <w:t>{{</w:t>
-            </w:r>
-            <w:proofErr w:type="spellStart"/>
-            <w:proofErr w:type="gramStart"/>
-            <w:r>
-              <w:rPr>
-                <w:rFonts w:eastAsia="Times New Roman" w:cs="Arial"/>
-                <w:color w:val="000000"/>
-                <w:sz w:val="18"/>
-                <w:szCs w:val="18"/>
-                <w:lang w:eastAsia="en-GB"/>
-              </w:rPr>
-              <w:t>canopy.supply</w:t>
-            </w:r>
-            <w:proofErr w:type="gramEnd"/>
-            <w:r>
-              <w:rPr>
-                <w:rFonts w:eastAsia="Times New Roman" w:cs="Arial"/>
-                <w:color w:val="000000"/>
-                <w:sz w:val="18"/>
-                <w:szCs w:val="18"/>
-                <w:lang w:eastAsia="en-GB"/>
-              </w:rPr>
-              <w:t>_air</w:t>
-            </w:r>
-            <w:proofErr w:type="spellEnd"/>
+              <w:t xml:space="preserve"> </w:t>
+            </w:r>
             <w:r>
               <w:rPr>
                 <w:rFonts w:eastAsia="Times New Roman" w:cs="Arial"/>
@@ -3731,29 +3643,6 @@
                 <w:lang w:eastAsia="en-GB"/>
               </w:rPr>
               <w:t>}}</w:t>
-            </w:r>
-          </w:p>
-          <w:p>
-            <w:pPr>
-              <w:spacing w:after="0" w:line="240" w:lineRule="auto"/>
-              <w:jc w:val="center"/>
-              <w:rPr>
-                <w:rFonts w:eastAsia="Times New Roman" w:cs="Arial"/>
-                <w:color w:val="000000"/>
-                <w:sz w:val="18"/>
-                <w:szCs w:val="18"/>
-                <w:lang w:eastAsia="en-GB"/>
-              </w:rPr>
-            </w:pPr>
-            <w:r>
-              <w:rPr>
-                <w:rFonts w:eastAsia="Times New Roman" w:cs="Arial"/>
-                <w:color w:val="000000"/>
-                <w:sz w:val="18"/>
-                <w:szCs w:val="18"/>
-                <w:lang w:eastAsia="en-GB"/>
-              </w:rPr>
-              <w:t>{% endif %}</w:t>
             </w:r>
           </w:p>
         </w:tc>
@@ -3906,7 +3795,7 @@
                 <w:szCs w:val="18"/>
                 <w:lang w:eastAsia="en-GB"/>
               </w:rPr>
-              <w:t>{{</w:t>
+              <w:t>LED</w:t>
             </w:r>
           </w:p>
           <w:p>
@@ -3921,53 +3810,6 @@
                 <w:lang w:eastAsia="en-GB"/>
               </w:rPr>
             </w:pPr>
-            <w:proofErr w:type="spellStart"/>
-            <w:proofErr w:type="gramStart"/>
-            <w:r>
-              <w:rPr>
-                <w:rFonts w:eastAsia="Times New Roman" w:cs="Arial"/>
-                <w:color w:val="000000"/>
-                <w:sz w:val="18"/>
-                <w:szCs w:val="18"/>
-                <w:lang w:eastAsia="en-GB"/>
-              </w:rPr>
-              <w:t>c</w:t>
-            </w:r>
-            <w:r>
-              <w:rPr>
-                <w:rFonts w:eastAsia="Times New Roman" w:cs="Arial"/>
-                <w:color w:val="000000"/>
-                <w:sz w:val="18"/>
-                <w:szCs w:val="18"/>
-                <w:lang w:eastAsia="en-GB"/>
-              </w:rPr>
-              <w:t>anopy.lights</w:t>
-            </w:r>
-            <w:proofErr w:type="spellEnd"/>
-            <w:proofErr w:type="gramEnd"/>
-          </w:p>
-          <w:p>
-            <w:pPr>
-              <w:spacing w:after="0" w:line="240" w:lineRule="auto"/>
-              <w:jc w:val="center"/>
-              <w:rPr>
-                <w:rFonts w:eastAsia="Times New Roman" w:cs="Arial"/>
-                <w:color w:val="000000"/>
-                <w:sz w:val="18"/>
-                <w:szCs w:val="18"/>
-                <w:lang w:eastAsia="en-GB"/>
-              </w:rPr>
-            </w:pPr>
-            <w:r>
-              <w:rPr>
-                <w:rFonts w:eastAsia="Times New Roman" w:cs="Arial"/>
-                <w:color w:val="000000"/>
-                <w:sz w:val="18"/>
-                <w:szCs w:val="18"/>
-                <w:lang w:eastAsia="en-GB"/>
-              </w:rPr>
-              <w:t>}}</w:t>
-            </w:r>
           </w:p>
         </w:tc>
       </w:tr>
@@ -4100,30 +3942,14 @@
           <w:rFonts w:cs="Arial"/>
           <w:szCs w:val="20"/>
         </w:rPr>
-        <w:t>floor_</w:t>
-      </w:r>
-      <w:proofErr w:type="gramStart"/>
+        <w:t>floor_data</w:t>
+      </w:r>
       <w:r>
         <w:rPr>
           <w:rFonts w:cs="Arial"/>
           <w:szCs w:val="20"/>
         </w:rPr>
-        <w:t>data</w:t>
-      </w:r>
-      <w:r>
-        <w:rPr>
-          <w:rFonts w:cs="Arial"/>
-          <w:szCs w:val="20"/>
-        </w:rPr>
-        <w:t>.important</w:t>
-      </w:r>
-      <w:proofErr w:type="gramEnd"/>
-      <w:r>
-        <w:rPr>
-          <w:rFonts w:cs="Arial"/>
-          <w:szCs w:val="20"/>
-        </w:rPr>
-        <w:t>_note</w:t>
+        <w:t>.important_note</w:t>
       </w:r>
       <w:proofErr w:type="spellEnd"/>
       <w:r>
@@ -5269,7 +5095,6 @@
                 <w:szCs w:val="18"/>
                 <w:lang w:eastAsia="en-GB"/>
               </w:rPr>
-              <w:lastRenderedPageBreak/>
               <w:t xml:space="preserve">{{ </w:t>
             </w:r>
             <w:proofErr w:type="spellStart"/>
@@ -5292,27 +5117,7 @@
                 <w:szCs w:val="18"/>
                 <w:lang w:eastAsia="en-GB"/>
               </w:rPr>
-              <w:t>.item_</w:t>
-            </w:r>
-            <w:r>
-              <w:rPr>
-                <w:rFonts w:eastAsia="Times New Roman" w:cs="Arial"/>
-                <w:color w:val="000000"/>
-                <w:sz w:val="18"/>
-                <w:szCs w:val="18"/>
-                <w:lang w:eastAsia="en-GB"/>
-              </w:rPr>
-              <w:t>n</w:t>
-            </w:r>
-            <w:r>
-              <w:rPr>
-                <w:rFonts w:eastAsia="Times New Roman" w:cs="Arial"/>
-                <w:color w:val="000000"/>
-                <w:sz w:val="18"/>
-                <w:szCs w:val="18"/>
-                <w:lang w:eastAsia="en-GB"/>
-              </w:rPr>
-              <w:t>umber</w:t>
+              <w:t>.item_no</w:t>
             </w:r>
             <w:proofErr w:type="spellEnd"/>
           </w:p>
@@ -5703,42 +5508,37 @@
               <w:rPr>
                 <w:rFonts w:eastAsia="Times New Roman" w:cs="Arial"/>
                 <w:color w:val="000000"/>
-                <w:sz w:val="2"/>
-                <w:szCs w:val="2"/>
-                <w:lang w:eastAsia="en-GB"/>
-              </w:rPr>
-            </w:pPr>
-            <w:r>
-              <w:rPr>
-                <w:rFonts w:eastAsia="Times New Roman" w:cs="Arial"/>
-                <w:color w:val="000000"/>
-                <w:sz w:val="2"/>
-                <w:szCs w:val="2"/>
-                <w:lang w:eastAsia="en-GB"/>
-              </w:rPr>
-              <w:t xml:space="preserve">{% </w:t>
-            </w:r>
-            <w:proofErr w:type="spellStart"/>
-            <w:r>
-              <w:rPr>
-                <w:rFonts w:eastAsia="Times New Roman" w:cs="Arial"/>
-                <w:color w:val="000000"/>
-                <w:sz w:val="2"/>
-                <w:szCs w:val="2"/>
-                <w:lang w:eastAsia="en-GB"/>
-              </w:rPr>
-              <w:t>endfor</w:t>
-            </w:r>
-            <w:proofErr w:type="spellEnd"/>
-            <w:r>
-              <w:rPr>
-                <w:rFonts w:eastAsia="Times New Roman" w:cs="Arial"/>
-                <w:color w:val="000000"/>
-                <w:sz w:val="2"/>
-                <w:szCs w:val="2"/>
-                <w:lang w:eastAsia="en-GB"/>
-              </w:rPr>
-              <w:t xml:space="preserve"> %}</w:t>
+                <w:szCs w:val="20"/>
+                <w:lang w:eastAsia="en-GB"/>
+              </w:rPr>
+            </w:pPr>
+            <w:r>
+              <w:rPr>
+                <w:rFonts w:eastAsia="Times New Roman" w:cs="Arial"/>
+                <w:color w:val="000000"/>
+                <w:szCs w:val="20"/>
+                <w:lang w:eastAsia="en-GB"/>
+              </w:rPr>
+              <w:lastRenderedPageBreak/>
+              <w:t>{%</w:t>
+            </w:r>
+            <w:r>
+              <w:rPr>
+                <w:rFonts w:eastAsia="Times New Roman" w:cs="Arial"/>
+                <w:color w:val="000000"/>
+                <w:szCs w:val="20"/>
+                <w:lang w:eastAsia="en-GB"/>
+              </w:rPr>
+              <w:t>tr</w:t>
+            </w:r>
+            <w:r>
+              <w:rPr>
+                <w:rFonts w:eastAsia="Times New Roman" w:cs="Arial"/>
+                <w:color w:val="000000"/>
+                <w:szCs w:val="20"/>
+                <w:lang w:eastAsia="en-GB"/>
+              </w:rPr>
+              <w:t xml:space="preserve"> endfor %}</w:t>
             </w:r>
           </w:p>
         </w:tc>
@@ -5905,21 +5705,6 @@
         </w:rPr>
         <w:t>{% endif %}</w:t>
       </w:r>
-    </w:p>
-    <w:p>
-      <w:pPr>
-        <w:tabs>
-          <w:tab w:val="left" w:pos="1440"/>
-          <w:tab w:val="right" w:pos="8730"/>
-        </w:tabs>
-        <w:spacing w:after="0" w:line="276" w:lineRule="auto"/>
-        <w:rPr>
-          <w:rFonts w:cs="Arial"/>
-          <w:b/>
-          <w:color w:val="2499D5"/>
-          <w:sz w:val="24"/>
-        </w:rPr>
-      </w:pPr>
     </w:p>
     <w:p>
       <w:pPr>
@@ -7386,10 +7171,20 @@
         <w:rPr>
           <w:rFonts w:cs="Arial"/>
           <w:b/>
+          <w:sz w:val="6"/>
+          <w:szCs w:val="6"/>
+        </w:rPr>
+      </w:pPr>
+      <w:r>
+        <w:rPr>
+          <w:rFonts w:cs="Arial"/>
+          <w:b/>
           <w:sz w:val="32"/>
           <w:szCs w:val="32"/>
         </w:rPr>
-      </w:pPr>
+        <w:t xml:space="preserve">Pricing </w:t>
+      </w:r>
+      <w:proofErr w:type="gramStart"/>
       <w:r>
         <w:rPr>
           <w:rFonts w:cs="Arial"/>
@@ -7397,96 +7192,66 @@
           <w:sz w:val="32"/>
           <w:szCs w:val="32"/>
         </w:rPr>
-        <w:t>Pricing Schedule</w:t>
-      </w:r>
-    </w:p>
-    <w:p>
-      <w:pPr>
-        <w:spacing w:after="0" w:line="276" w:lineRule="auto"/>
+        <w:t>Schedule</w:t>
+      </w:r>
+      <w:r>
         <w:rPr>
           <w:rFonts w:cs="Arial"/>
           <w:b/>
-          <w:sz w:val="32"/>
-          <w:szCs w:val="32"/>
-        </w:rPr>
-      </w:pPr>
+          <w:sz w:val="6"/>
+          <w:szCs w:val="6"/>
+        </w:rPr>
+        <w:t>{</w:t>
+      </w:r>
+      <w:proofErr w:type="gramEnd"/>
       <w:r>
         <w:rPr>
           <w:rFonts w:cs="Arial"/>
           <w:b/>
-          <w:sz w:val="32"/>
-          <w:szCs w:val="32"/>
-        </w:rPr>
-        <w:t xml:space="preserve">{% for </w:t>
+          <w:sz w:val="6"/>
+          <w:szCs w:val="6"/>
+        </w:rPr>
+        <w:t xml:space="preserve">% for </w:t>
       </w:r>
       <w:proofErr w:type="spellStart"/>
       <w:r>
         <w:rPr>
           <w:rFonts w:cs="Arial"/>
           <w:b/>
-          <w:sz w:val="32"/>
-          <w:szCs w:val="32"/>
-        </w:rPr>
-        <w:t>kitchen</w:t>
-      </w:r>
+          <w:sz w:val="6"/>
+          <w:szCs w:val="6"/>
+        </w:rPr>
+        <w:t>kitchen_name</w:t>
+      </w:r>
+      <w:proofErr w:type="spellEnd"/>
       <w:r>
         <w:rPr>
           <w:rFonts w:cs="Arial"/>
           <w:b/>
-          <w:sz w:val="32"/>
-          <w:szCs w:val="32"/>
-        </w:rPr>
-        <w:t>_name</w:t>
+          <w:sz w:val="6"/>
+          <w:szCs w:val="6"/>
+        </w:rPr>
+        <w:t xml:space="preserve">, floors in </w:t>
+      </w:r>
+      <w:proofErr w:type="spellStart"/>
+      <w:r>
+        <w:rPr>
+          <w:rFonts w:cs="Arial"/>
+          <w:b/>
+          <w:sz w:val="6"/>
+          <w:szCs w:val="6"/>
+        </w:rPr>
+        <w:t>grouped_canopy_data.items</w:t>
       </w:r>
       <w:proofErr w:type="spellEnd"/>
       <w:r>
         <w:rPr>
           <w:rFonts w:cs="Arial"/>
           <w:b/>
-          <w:sz w:val="32"/>
-          <w:szCs w:val="32"/>
-        </w:rPr>
-        <w:t xml:space="preserve">, floors in </w:t>
-      </w:r>
-      <w:proofErr w:type="spellStart"/>
-      <w:r>
-        <w:rPr>
-          <w:rFonts w:cs="Arial"/>
-          <w:b/>
-          <w:sz w:val="32"/>
-          <w:szCs w:val="32"/>
-        </w:rPr>
-        <w:t>grouped_canopy_</w:t>
-      </w:r>
-      <w:proofErr w:type="gramStart"/>
-      <w:r>
-        <w:rPr>
-          <w:rFonts w:cs="Arial"/>
-          <w:b/>
-          <w:sz w:val="32"/>
-          <w:szCs w:val="32"/>
-        </w:rPr>
-        <w:t>data.items</w:t>
-      </w:r>
-      <w:proofErr w:type="spellEnd"/>
-      <w:proofErr w:type="gramEnd"/>
-      <w:r>
-        <w:rPr>
-          <w:rFonts w:cs="Arial"/>
-          <w:b/>
-          <w:sz w:val="32"/>
-          <w:szCs w:val="32"/>
-        </w:rPr>
-        <w:t>()</w:t>
-      </w:r>
-      <w:r>
-        <w:rPr>
-          <w:rFonts w:cs="Arial"/>
-          <w:b/>
-          <w:sz w:val="32"/>
-          <w:szCs w:val="32"/>
-        </w:rPr>
-        <w:t xml:space="preserve"> %}</w:t>
+          <w:sz w:val="6"/>
+          <w:szCs w:val="6"/>
+        </w:rPr>
+        <w:t>() %}</w:t>
       </w:r>
     </w:p>
     <w:p>
@@ -7960,7 +7725,6 @@
                 <w:szCs w:val="18"/>
                 <w:lang w:eastAsia="en-GB"/>
               </w:rPr>
-              <w:lastRenderedPageBreak/>
               <w:t>{{</w:t>
             </w:r>
             <w:proofErr w:type="spellStart"/>
@@ -8032,7 +7796,6 @@
                 <w:szCs w:val="18"/>
                 <w:lang w:eastAsia="en-GB"/>
               </w:rPr>
-              <w:lastRenderedPageBreak/>
               <w:t>Halton</w:t>
             </w:r>
             <w:r>
@@ -8189,6 +7952,16 @@
                 <w:lang w:eastAsia="en-GB"/>
               </w:rPr>
               <w:t>}}</w:t>
+            </w:r>
+            <w:r>
+              <w:rPr>
+                <w:rFonts w:eastAsia="Times New Roman" w:cs="Arial"/>
+                <w:color w:val="000000"/>
+                <w:sz w:val="18"/>
+                <w:szCs w:val="18"/>
+                <w:lang w:eastAsia="en-GB"/>
+              </w:rPr>
+              <w:t>.</w:t>
             </w:r>
             <w:r>
               <w:rPr>
@@ -8633,6 +8406,16 @@
               </w:rPr>
               <w:t>}</w:t>
             </w:r>
+            <w:r>
+              <w:rPr>
+                <w:rFonts w:eastAsia="Times New Roman" w:cs="Arial"/>
+                <w:color w:val="000000"/>
+                <w:sz w:val="18"/>
+                <w:szCs w:val="18"/>
+                <w:lang w:eastAsia="en-GB"/>
+              </w:rPr>
+              <w:t>.0</w:t>
+            </w:r>
           </w:p>
         </w:tc>
       </w:tr>
@@ -8756,6 +8539,7 @@
                 <w:lang w:eastAsia="en-GB"/>
               </w:rPr>
             </w:pPr>
+            <w:proofErr w:type="gramStart"/>
             <w:r>
               <w:rPr>
                 <w:rFonts w:eastAsia="Times New Roman" w:cs="Arial"/>
@@ -8766,8 +8550,73 @@
               </w:rPr>
               <w:t>£</w:t>
             </w:r>
+            <w:r>
+              <w:rPr>
+                <w:rFonts w:eastAsia="Times New Roman" w:cs="Arial"/>
+                <w:color w:val="000000"/>
+                <w:sz w:val="18"/>
+                <w:szCs w:val="18"/>
+                <w:lang w:eastAsia="en-GB"/>
+              </w:rPr>
+              <w:t>{</w:t>
+            </w:r>
+            <w:proofErr w:type="gramEnd"/>
+            <w:r>
+              <w:rPr>
+                <w:rFonts w:eastAsia="Times New Roman" w:cs="Arial"/>
+                <w:color w:val="000000"/>
+                <w:sz w:val="18"/>
+                <w:szCs w:val="18"/>
+                <w:lang w:eastAsia="en-GB"/>
+              </w:rPr>
+              <w:t>{</w:t>
+            </w:r>
+            <w:proofErr w:type="spellStart"/>
+            <w:r>
+              <w:rPr>
+                <w:rFonts w:eastAsia="Times New Roman" w:cs="Arial"/>
+                <w:color w:val="000000"/>
+                <w:sz w:val="18"/>
+                <w:szCs w:val="18"/>
+                <w:lang w:eastAsia="en-GB"/>
+              </w:rPr>
+              <w:t>floor_data</w:t>
+            </w:r>
+            <w:r>
+              <w:rPr>
+                <w:rFonts w:eastAsia="Times New Roman" w:cs="Arial"/>
+                <w:color w:val="000000"/>
+                <w:sz w:val="18"/>
+                <w:szCs w:val="18"/>
+                <w:lang w:eastAsia="en-GB"/>
+              </w:rPr>
+              <w:t>.test_commission</w:t>
+            </w:r>
+            <w:proofErr w:type="spellEnd"/>
+            <w:r>
+              <w:rPr>
+                <w:rFonts w:eastAsia="Times New Roman" w:cs="Arial"/>
+                <w:color w:val="000000"/>
+                <w:sz w:val="18"/>
+                <w:szCs w:val="18"/>
+                <w:lang w:eastAsia="en-GB"/>
+              </w:rPr>
+              <w:t xml:space="preserve"> </w:t>
+            </w:r>
+            <w:r>
+              <w:rPr>
+                <w:rFonts w:eastAsia="Times New Roman" w:cs="Arial"/>
+                <w:color w:val="000000"/>
+                <w:sz w:val="18"/>
+                <w:szCs w:val="18"/>
+                <w:lang w:eastAsia="en-GB"/>
+              </w:rPr>
+              <w:t>}}</w:t>
+            </w:r>
+            <w:proofErr w:type="spellStart"/>
           </w:p>
         </w:tc>
+        <w:proofErr w:type="spellEnd"/>
       </w:tr>
       <w:tr>
         <w:trPr>
@@ -8883,6 +8732,50 @@
               </w:rPr>
               <w:t>£</w:t>
             </w:r>
+            <w:r>
+              <w:rPr>
+                <w:rFonts w:eastAsia="Times New Roman" w:cs="Arial"/>
+                <w:b/>
+                <w:bCs/>
+                <w:color w:val="000000"/>
+                <w:szCs w:val="20"/>
+                <w:lang w:eastAsia="en-GB"/>
+              </w:rPr>
+              <w:t>{{floor_data.subtotal</w:t>
+            </w:r>
+            <w:r>
+              <w:rPr>
+                <w:rFonts w:eastAsia="Times New Roman" w:cs="Arial"/>
+                <w:b/>
+                <w:bCs/>
+                <w:color w:val="000000"/>
+                <w:szCs w:val="20"/>
+                <w:lang w:eastAsia="en-GB"/>
+              </w:rPr>
+              <w:t>+floor_data.p182</w:t>
+            </w:r>
+            <w:r>
+              <w:rPr>
+                <w:rFonts w:eastAsia="Times New Roman" w:cs="Arial"/>
+                <w:b/>
+                <w:bCs/>
+                <w:color w:val="000000"/>
+                <w:szCs w:val="20"/>
+                <w:lang w:eastAsia="en-GB"/>
+              </w:rPr>
+              <w:t xml:space="preserve"> </w:t>
+            </w:r>
+            <w:r>
+              <w:rPr>
+                <w:rFonts w:eastAsia="Times New Roman" w:cs="Arial"/>
+                <w:b/>
+                <w:bCs/>
+                <w:color w:val="000000"/>
+                <w:szCs w:val="20"/>
+                <w:lang w:eastAsia="en-GB"/>
+              </w:rPr>
+              <w:t>}}</w:t>
+            </w:r>
           </w:p>
         </w:tc>
       </w:tr>
@@ -9008,10 +8901,10 @@
         <w:tblLook w:val="04A0" w:firstRow="1" w:lastRow="0" w:firstColumn="1" w:lastColumn="0" w:noHBand="0" w:noVBand="1"/>
       </w:tblPr>
       <w:tblGrid>
-        <w:gridCol w:w="427"/>
-        <w:gridCol w:w="865"/>
-        <w:gridCol w:w="6464"/>
-        <w:gridCol w:w="1815"/>
+        <w:gridCol w:w="392"/>
+        <w:gridCol w:w="831"/>
+        <w:gridCol w:w="6430"/>
+        <w:gridCol w:w="1918"/>
       </w:tblGrid>
       <w:tr>
         <w:trPr>
@@ -9341,6 +9234,7 @@
               </w:rPr>
               <w:t>{{</w:t>
             </w:r>
+            <w:proofErr w:type="spellStart"/>
             <w:proofErr w:type="gramStart"/>
             <w:r>
               <w:rPr>
@@ -9361,7 +9255,28 @@
                 <w:szCs w:val="18"/>
                 <w:lang w:eastAsia="en-GB"/>
               </w:rPr>
-              <w:t>_price}}</w:t>
+              <w:t>_price</w:t>
+            </w:r>
+            <w:proofErr w:type="spellEnd"/>
+            <w:r>
+              <w:rPr>
+                <w:rFonts w:eastAsia="Times New Roman" w:cs="Arial"/>
+                <w:color w:val="000000"/>
+                <w:sz w:val="18"/>
+                <w:szCs w:val="18"/>
+                <w:lang w:eastAsia="en-GB"/>
+              </w:rPr>
+              <w:t>}}</w:t>
+            </w:r>
+            <w:r>
+              <w:rPr>
+                <w:rFonts w:eastAsia="Times New Roman" w:cs="Arial"/>
+                <w:color w:val="000000"/>
+                <w:sz w:val="18"/>
+                <w:szCs w:val="18"/>
+                <w:lang w:eastAsia="en-GB"/>
+              </w:rPr>
+              <w:t>.0</w:t>
             </w:r>
           </w:p>
         </w:tc>
@@ -9562,16 +9477,6 @@
           <w:szCs w:val="12"/>
         </w:rPr>
       </w:pPr>
-    </w:p>
-    <w:p>
-      <w:pPr>
-        <w:spacing w:after="0" w:line="276" w:lineRule="auto"/>
-        <w:rPr>
-          <w:bCs/>
-          <w:sz w:val="12"/>
-          <w:szCs w:val="12"/>
-        </w:rPr>
-      </w:pPr>
       <w:r>
         <w:rPr>
           <w:rFonts w:eastAsia="Times New Roman" w:cs="Arial"/>
@@ -9582,6 +9487,7 @@
         </w:rPr>
         <w:t xml:space="preserve">{% if </w:t>
       </w:r>
+      <w:proofErr w:type="spellStart"/>
       <w:r>
         <w:rPr>
           <w:rFonts w:eastAsia="Times New Roman" w:cs="Arial"/>
@@ -9590,8 +9496,41 @@
           <w:szCs w:val="18"/>
           <w:lang w:eastAsia="en-GB"/>
         </w:rPr>
-        <w:t>true</w:t>
-      </w:r>
+        <w:t>floor_</w:t>
+      </w:r>
+      <w:proofErr w:type="gramStart"/>
+      <w:r>
+        <w:rPr>
+          <w:rFonts w:eastAsia="Times New Roman" w:cs="Arial"/>
+          <w:color w:val="000000"/>
+          <w:sz w:val="18"/>
+          <w:szCs w:val="18"/>
+          <w:lang w:eastAsia="en-GB"/>
+        </w:rPr>
+        <w:t>data</w:t>
+      </w:r>
+      <w:r>
+        <w:rPr>
+          <w:rFonts w:eastAsia="Times New Roman" w:cs="Arial"/>
+          <w:color w:val="000000"/>
+          <w:sz w:val="18"/>
+          <w:szCs w:val="18"/>
+          <w:lang w:eastAsia="en-GB"/>
+        </w:rPr>
+        <w:t>.floor</w:t>
+      </w:r>
+      <w:proofErr w:type="gramEnd"/>
+      <w:r>
+        <w:rPr>
+          <w:rFonts w:eastAsia="Times New Roman" w:cs="Arial"/>
+          <w:color w:val="000000"/>
+          <w:sz w:val="18"/>
+          <w:szCs w:val="18"/>
+          <w:lang w:eastAsia="en-GB"/>
+        </w:rPr>
+        <w:t>_data.cladding_canopies</w:t>
+      </w:r>
+      <w:proofErr w:type="spellEnd"/>
       <w:r>
         <w:rPr>
           <w:rFonts w:eastAsia="Times New Roman" w:cs="Arial"/>
@@ -9891,10 +9830,8 @@
                 <w:szCs w:val="22"/>
                 <w:lang w:eastAsia="en-GB"/>
               </w:rPr>
-              <w:t>data.canopies</w:t>
-            </w:r>
-            <w:proofErr w:type="spellEnd"/>
-            <w:proofErr w:type="gramEnd"/>
+              <w:t>data.</w:t>
+            </w:r>
             <w:r>
               <w:rPr>
                 <w:rFonts w:eastAsia="Times New Roman" w:cs="Arial"/>
@@ -9903,8 +9840,30 @@
                 <w:szCs w:val="22"/>
                 <w:lang w:eastAsia="en-GB"/>
               </w:rPr>
-              <w:t xml:space="preserve"> </w:t>
-            </w:r>
+              <w:t>floor</w:t>
+            </w:r>
+            <w:proofErr w:type="gramEnd"/>
+            <w:r>
+              <w:rPr>
+                <w:rFonts w:eastAsia="Times New Roman" w:cs="Arial"/>
+                <w:color w:val="000000"/>
+                <w:sz w:val="22"/>
+                <w:szCs w:val="22"/>
+                <w:lang w:eastAsia="en-GB"/>
+              </w:rPr>
+              <w:t>_data.c</w:t>
+            </w:r>
+            <w:r>
+              <w:rPr>
+                <w:rFonts w:eastAsia="Times New Roman" w:cs="Arial"/>
+                <w:color w:val="000000"/>
+                <w:sz w:val="22"/>
+                <w:szCs w:val="22"/>
+                <w:lang w:eastAsia="en-GB"/>
+              </w:rPr>
+              <w:t>ladding_canopies</w:t>
+            </w:r>
+            <w:proofErr w:type="spellEnd"/>
             <w:r>
               <w:rPr>
                 <w:rFonts w:eastAsia="Times New Roman" w:cs="Arial"/>
@@ -10003,7 +9962,7 @@
       </w:tr>
       <w:tr>
         <w:trPr>
-          <w:trHeight w:val="850"/>
+          <w:trHeight w:val="591"/>
         </w:trPr>
         <w:tc>
           <w:tcPr>
@@ -10125,6 +10084,16 @@
                 <w:szCs w:val="18"/>
                 <w:lang w:eastAsia="en-GB"/>
               </w:rPr>
+              <w:t xml:space="preserve"> </w:t>
+            </w:r>
+            <w:r>
+              <w:rPr>
+                <w:rFonts w:eastAsia="Times New Roman" w:cs="Arial"/>
+                <w:color w:val="000000"/>
+                <w:sz w:val="18"/>
+                <w:szCs w:val="18"/>
+                <w:lang w:eastAsia="en-GB"/>
+              </w:rPr>
               <w:t>-</w:t>
             </w:r>
             <w:r>
@@ -10262,6 +10231,7 @@
                 <w:lang w:eastAsia="en-GB"/>
               </w:rPr>
             </w:pPr>
+            <w:proofErr w:type="gramStart"/>
             <w:r>
               <w:rPr>
                 <w:rFonts w:eastAsia="Times New Roman" w:cs="Arial"/>
@@ -10281,10 +10251,32 @@
                 <w:szCs w:val="18"/>
                 <w:lang w:eastAsia="en-GB"/>
               </w:rPr>
-              <w:t>{{</w:t>
+              <w:t>{</w:t>
+            </w:r>
+            <w:proofErr w:type="gramEnd"/>
+            <w:r>
+              <w:rPr>
+                <w:rFonts w:eastAsia="Times New Roman" w:cs="Arial"/>
+                <w:bCs/>
+                <w:color w:val="000000"/>
+                <w:sz w:val="18"/>
+                <w:szCs w:val="18"/>
+                <w:lang w:eastAsia="en-GB"/>
+              </w:rPr>
+              <w:t>{</w:t>
+            </w:r>
+            <w:r>
+              <w:rPr>
+                <w:rFonts w:eastAsia="Times New Roman" w:cs="Arial"/>
+                <w:bCs/>
+                <w:color w:val="000000"/>
+                <w:sz w:val="18"/>
+                <w:szCs w:val="18"/>
+                <w:lang w:eastAsia="en-GB"/>
+              </w:rPr>
+              <w:t xml:space="preserve">- </w:t>
             </w:r>
             <w:proofErr w:type="spellStart"/>
-            <w:proofErr w:type="gramStart"/>
             <w:r>
               <w:rPr>
                 <w:rFonts w:eastAsia="Times New Roman" w:cs="Arial"/>
@@ -10294,9 +10286,9 @@
                 <w:szCs w:val="18"/>
                 <w:lang w:eastAsia="en-GB"/>
               </w:rPr>
-              <w:t>canopy.cladding</w:t>
-            </w:r>
-            <w:proofErr w:type="gramEnd"/>
+              <w:t>canopy.cladding_price</w:t>
+            </w:r>
+            <w:proofErr w:type="spellEnd"/>
             <w:r>
               <w:rPr>
                 <w:rFonts w:eastAsia="Times New Roman" w:cs="Arial"/>
@@ -10306,9 +10298,8 @@
                 <w:szCs w:val="18"/>
                 <w:lang w:eastAsia="en-GB"/>
               </w:rPr>
-              <w:t>_price</w:t>
-            </w:r>
-            <w:proofErr w:type="spellEnd"/>
+              <w:t xml:space="preserve"> -</w:t>
+            </w:r>
             <w:r>
               <w:rPr>
                 <w:rFonts w:eastAsia="Times New Roman" w:cs="Arial"/>
@@ -10319,17 +10310,6 @@
                 <w:lang w:eastAsia="en-GB"/>
               </w:rPr>
               <w:t>}}</w:t>
-            </w:r>
-            <w:r>
-              <w:rPr>
-                <w:rFonts w:eastAsia="Times New Roman" w:cs="Arial"/>
-                <w:bCs/>
-                <w:color w:val="000000"/>
-                <w:sz w:val="18"/>
-                <w:szCs w:val="18"/>
-                <w:lang w:eastAsia="en-GB"/>
-              </w:rPr>
-              <w:t>0</w:t>
             </w:r>
           </w:p>
         </w:tc>
@@ -10396,6 +10376,28 @@
                 <w:szCs w:val="18"/>
                 <w:lang w:eastAsia="en-GB"/>
               </w:rPr>
+              <w:t>{% endif %}</w:t>
+            </w:r>
+          </w:p>
+          <w:p>
+            <w:pPr>
+              <w:spacing w:after="0" w:line="276" w:lineRule="auto"/>
+              <w:rPr>
+                <w:rFonts w:eastAsia="Times New Roman" w:cs="Arial"/>
+                <w:color w:val="000000"/>
+                <w:sz w:val="18"/>
+                <w:szCs w:val="18"/>
+                <w:lang w:eastAsia="en-GB"/>
+              </w:rPr>
+            </w:pPr>
+            <w:r>
+              <w:rPr>
+                <w:rFonts w:eastAsia="Times New Roman" w:cs="Arial"/>
+                <w:color w:val="000000"/>
+                <w:sz w:val="18"/>
+                <w:szCs w:val="18"/>
+                <w:lang w:eastAsia="en-GB"/>
+              </w:rPr>
               <w:t>{%</w:t>
             </w:r>
             <w:r>
@@ -10590,7 +10592,7 @@
           <w:p>
             <w:pPr>
               <w:spacing w:after="0" w:line="240" w:lineRule="auto"/>
-              <w:jc w:val="right"/>
+              <w:jc w:val="center"/>
               <w:rPr>
                 <w:rFonts w:eastAsia="Times New Roman" w:cs="Arial"/>
                 <w:b/>
@@ -10600,10 +10602,90 @@
                 <w:lang w:eastAsia="en-GB"/>
               </w:rPr>
             </w:pPr>
+            <w:r>
+              <w:rPr>
+                <w:rFonts w:eastAsia="Times New Roman" w:cs="Arial"/>
+                <w:b/>
+                <w:bCs/>
+                <w:color w:val="000000"/>
+                <w:szCs w:val="20"/>
+                <w:lang w:eastAsia="en-GB"/>
+              </w:rPr>
+              <w:t>£</w:t>
+            </w:r>
+            <w:r>
+              <w:rPr>
+                <w:rFonts w:eastAsia="Times New Roman" w:cs="Arial"/>
+                <w:b/>
+                <w:bCs/>
+                <w:color w:val="000000"/>
+                <w:szCs w:val="20"/>
+                <w:lang w:eastAsia="en-GB"/>
+              </w:rPr>
+              <w:t>{{</w:t>
+            </w:r>
+            <w:proofErr w:type="spellStart"/>
+            <w:r>
+              <w:rPr>
+                <w:rFonts w:eastAsia="Times New Roman" w:cs="Arial"/>
+                <w:b/>
+                <w:bCs/>
+                <w:color w:val="000000"/>
+                <w:szCs w:val="20"/>
+                <w:lang w:eastAsia="en-GB"/>
+              </w:rPr>
+              <w:t>floor_</w:t>
+            </w:r>
+            <w:proofErr w:type="gramStart"/>
+            <w:r>
+              <w:rPr>
+                <w:rFonts w:eastAsia="Times New Roman" w:cs="Arial"/>
+                <w:b/>
+                <w:bCs/>
+                <w:color w:val="000000"/>
+                <w:szCs w:val="20"/>
+                <w:lang w:eastAsia="en-GB"/>
+              </w:rPr>
+              <w:t>data.cladding</w:t>
+            </w:r>
+            <w:proofErr w:type="gramEnd"/>
+            <w:r>
+              <w:rPr>
+                <w:rFonts w:eastAsia="Times New Roman" w:cs="Arial"/>
+                <w:b/>
+                <w:bCs/>
+                <w:color w:val="000000"/>
+                <w:szCs w:val="20"/>
+                <w:lang w:eastAsia="en-GB"/>
+              </w:rPr>
+              <w:t>_total</w:t>
+            </w:r>
+            <w:proofErr w:type="spellEnd"/>
+            <w:r>
+              <w:rPr>
+                <w:rFonts w:eastAsia="Times New Roman" w:cs="Arial"/>
+                <w:b/>
+                <w:bCs/>
+                <w:color w:val="000000"/>
+                <w:szCs w:val="20"/>
+                <w:lang w:eastAsia="en-GB"/>
+              </w:rPr>
+              <w:t>}}</w:t>
+            </w:r>
           </w:p>
         </w:tc>
       </w:tr>
     </w:tbl>
+    <w:p>
+      <w:pPr>
+        <w:spacing w:after="0" w:line="276" w:lineRule="auto"/>
+        <w:rPr>
+          <w:bCs/>
+          <w:sz w:val="12"/>
+          <w:szCs w:val="12"/>
+        </w:rPr>
+      </w:pPr>
+    </w:p>
     <w:p>
       <w:pPr>
         <w:spacing w:after="0" w:line="276" w:lineRule="auto"/>
@@ -10644,8 +10726,8 @@
         <w:tblLook w:val="04A0" w:firstRow="1" w:lastRow="0" w:firstColumn="1" w:lastColumn="0" w:noHBand="0" w:noVBand="1"/>
       </w:tblPr>
       <w:tblGrid>
-        <w:gridCol w:w="391"/>
-        <w:gridCol w:w="5325"/>
+        <w:gridCol w:w="393"/>
+        <w:gridCol w:w="5323"/>
         <w:gridCol w:w="3925"/>
       </w:tblGrid>
       <w:tr>
@@ -10732,7 +10814,7 @@
                 <w:sz w:val="24"/>
                 <w:lang w:val="en-CA" w:eastAsia="en-US"/>
               </w:rPr>
-              <w:t>{{</w:t>
+              <w:t xml:space="preserve"> {{</w:t>
             </w:r>
             <w:proofErr w:type="spellStart"/>
             <w:r>
@@ -10744,7 +10826,7 @@
                 <w:sz w:val="24"/>
                 <w:lang w:val="en-CA" w:eastAsia="en-US"/>
               </w:rPr>
-              <w:t>kitchen_</w:t>
+              <w:t>floor_</w:t>
             </w:r>
             <w:proofErr w:type="gramStart"/>
             <w:r>
@@ -10767,18 +10849,7 @@
                 <w:sz w:val="24"/>
                 <w:lang w:val="en-CA" w:eastAsia="en-US"/>
               </w:rPr>
-              <w:t>.</w:t>
-            </w:r>
-            <w:r>
-              <w:rPr>
-                <w:rFonts w:eastAsia="Times New Roman" w:cs="Arial"/>
-                <w:b/>
-                <w:bCs/>
-                <w:color w:val="000000"/>
-                <w:sz w:val="24"/>
-                <w:lang w:val="en-CA" w:eastAsia="en-US"/>
-              </w:rPr>
-              <w:t>upper</w:t>
+              <w:t>.upper</w:t>
             </w:r>
             <w:proofErr w:type="spellEnd"/>
             <w:proofErr w:type="gramEnd"/>
@@ -10985,7 +11056,7 @@
                 <w:sz w:val="24"/>
                 <w:lang w:val="en-CA" w:eastAsia="en-US"/>
               </w:rPr>
-              <w:t>.00 </w:t>
+              <w:t>.0 </w:t>
             </w:r>
           </w:p>
         </w:tc>
@@ -11287,6 +11358,75 @@
                 <w:rFonts w:eastAsia="Times New Roman" w:cs="Arial"/>
                 <w:b/>
                 <w:bCs/>
+                <w:color w:val="FFFFFF"/>
+                <w:sz w:val="24"/>
+                <w:lang w:val="en-CA" w:eastAsia="en-US"/>
+              </w:rPr>
+              <w:t>£</w:t>
+            </w:r>
+            <w:r>
+              <w:rPr>
+                <w:rFonts w:eastAsia="Times New Roman" w:cs="Arial"/>
+                <w:b/>
+                <w:bCs/>
+                <w:color w:val="FFFFFF" w:themeColor="background1"/>
+                <w:sz w:val="24"/>
+                <w:lang w:eastAsia="en-GB"/>
+              </w:rPr>
+              <w:t>{{</w:t>
+            </w:r>
+            <w:proofErr w:type="spellStart"/>
+            <w:r>
+              <w:rPr>
+                <w:rFonts w:eastAsia="Times New Roman" w:cs="Arial"/>
+                <w:b/>
+                <w:bCs/>
+                <w:color w:val="FFFFFF" w:themeColor="background1"/>
+                <w:sz w:val="24"/>
+                <w:lang w:eastAsia="en-GB"/>
+              </w:rPr>
+              <w:t>total_job_price</w:t>
+            </w:r>
+            <w:proofErr w:type="spellEnd"/>
+            <w:r>
+              <w:rPr>
+                <w:rFonts w:eastAsia="Times New Roman" w:cs="Arial"/>
+                <w:b/>
+                <w:bCs/>
+                <w:color w:val="FFFFFF" w:themeColor="background1"/>
+                <w:sz w:val="24"/>
+                <w:lang w:eastAsia="en-GB"/>
+              </w:rPr>
+              <w:t>}</w:t>
+            </w:r>
+            <w:r>
+              <w:rPr>
+                <w:rFonts w:eastAsia="Times New Roman" w:cs="Arial"/>
+                <w:b/>
+                <w:bCs/>
+                <w:color w:val="FFFFFF" w:themeColor="background1"/>
+                <w:sz w:val="24"/>
+                <w:lang w:eastAsia="en-GB"/>
+              </w:rPr>
+              <w:t>}</w:t>
+            </w:r>
+            <w:r>
+              <w:rPr>
+                <w:rFonts w:eastAsia="Times New Roman" w:cs="Arial"/>
+                <w:b/>
+                <w:bCs/>
+                <w:color w:val="FFFFFF" w:themeColor="background1"/>
+                <w:sz w:val="24"/>
+                <w:lang w:eastAsia="en-GB"/>
+              </w:rPr>
+              <w:t>.0</w:t>
+            </w:r>
+            <w:r>
+              <w:rPr>
+                <w:rFonts w:eastAsia="Times New Roman" w:cs="Arial"/>
+                <w:b/>
+                <w:bCs/>
+                <w:color w:val="FFFFFF" w:themeColor="background1"/>
                 <w:sz w:val="24"/>
                 <w:lang w:eastAsia="en-GB"/>
               </w:rPr>
@@ -12286,7 +12426,6 @@
                 <w:sz w:val="24"/>
                 <w:lang w:eastAsia="en-GB"/>
               </w:rPr>
-              <w:lastRenderedPageBreak/>
               <w:t>£</w:t>
             </w:r>
           </w:p>
@@ -13691,6 +13830,7 @@
           <w:sz w:val="18"/>
           <w:szCs w:val="18"/>
         </w:rPr>
+        <w:lastRenderedPageBreak/>
         <w:t>Fire Suppression System.</w:t>
       </w:r>
     </w:p>
@@ -13774,7 +13914,6 @@
           <w:sz w:val="18"/>
           <w:szCs w:val="18"/>
         </w:rPr>
-        <w:lastRenderedPageBreak/>
         <w:t>Gas Interlocking System in accordance with BS:6173, to include gas solenoid valve and proving sensors.</w:t>
       </w:r>
     </w:p>
@@ -15668,6 +15807,7 @@
           <w:sz w:val="13"/>
           <w:szCs w:val="15"/>
         </w:rPr>
+        <w:lastRenderedPageBreak/>
         <w:t>1.10</w:t>
       </w:r>
       <w:r>
@@ -15826,7 +15966,6 @@
           <w:sz w:val="13"/>
           <w:szCs w:val="15"/>
         </w:rPr>
-        <w:lastRenderedPageBreak/>
         <w:t>1.15</w:t>
       </w:r>
       <w:r>
@@ -16778,7 +16917,11 @@
       </w:r>
       <w:r>
         <w:tab/>
-        <w:t>Notwithstanding that the goods (or any part of them) remain the property of Halton Foodservice; the Customer may sell or use the goods in the ordinary course of the Customers business at full market value for the account of Halton Foodservice.  Any such sale or dealing shall be a sale or use of Halton Foodservice’s property by the Customer on the Customer’s own behalf and the Customer shall deal as principal when making such sale or dealings.  Until property in the goods passes from Halton Foodservice the entire proceeds of sale or otherwise of the goods shall be held in trust for Halton Foodservice and shall not be mixed with other monies or paid into any overdrawn bank account and shall be at all material times identified as Halton Foodservice’s money.</w:t>
+        <w:t xml:space="preserve">Notwithstanding that the goods (or any part of them) remain the property of Halton Foodservice; the Customer may sell or use the goods in the ordinary course of the Customers business at full market value for the account of Halton Foodservice.  Any such sale or dealing shall be a sale or use of Halton Foodservice’s property by the Customer on the Customer’s own behalf and the Customer shall deal as principal when making such sale or dealings.  Until property in the goods passes </w:t>
+      </w:r>
+      <w:r>
+        <w:lastRenderedPageBreak/>
+        <w:t>from Halton Foodservice the entire proceeds of sale or otherwise of the goods shall be held in trust for Halton Foodservice and shall not be mixed with other monies or paid into any overdrawn bank account and shall be at all material times identified as Halton Foodservice’s money.</w:t>
       </w:r>
     </w:p>
     <w:p>
@@ -16810,7 +16953,6 @@
         <w:pStyle w:val="BodyTextIndent2"/>
       </w:pPr>
       <w:r>
-        <w:lastRenderedPageBreak/>
         <w:t xml:space="preserve">8.7 </w:t>
       </w:r>
       <w:r>

</xml_diff>